<commit_message>
Rebuild all packs on the standalone project models (own timelines), remove retained-unit wording, add source models
Co-Authored-By: Claude Sonnet 5.5 <noreply@anthropic.com>
Claude-Session: https://claude.ai/code/session_01Tace5U23AKexiDyfCZxMPM
</commit_message>
<xml_diff>
--- a/output/00_How_To_Read_The_Outputs.docx
+++ b/output/00_How_To_Read_The_Outputs.docx
@@ -1925,6 +1925,46 @@
               <w:rPr>
                 <w:sz w:val="19"/>
               </w:rPr>
+              <w:t>Month numbers</w:t>
+            </w:r>
+          </w:p>
+        </w:tc>
+        <w:tc>
+          <w:tcPr>
+            <w:tcW w:type="dxa" w:w="6860"/>
+          </w:tcPr>
+          <w:p>
+            <w:pPr>
+              <w:spacing w:after="0" w:line="240" w:lineRule="auto"/>
+            </w:pPr>
+            <w:r/>
+            <w:r>
+              <w:rPr>
+                <w:sz w:val="19"/>
+              </w:rPr>
+              <w:t>In every single-project pack, month 1 is that project's own sales launch; month 0 and negative months are before launch. The landlord down payment, and so the investor's funding, falls at month -3 (Green Square) and month 0 (L'avenir). In the combined pack each project uses its own months, except the combined cash position, which uses one common calendar: Green Square launch = month 1 and L'avenir launch = month 7.</w:t>
+            </w:r>
+          </w:p>
+        </w:tc>
+      </w:tr>
+      <w:tr>
+        <w:trPr>
+          <w:cantSplit/>
+        </w:trPr>
+        <w:tc>
+          <w:tcPr>
+            <w:tcW w:type="dxa" w:w="2381"/>
+            <w:shd w:val="clear" w:color="auto" w:fill="F2F4F7"/>
+          </w:tcPr>
+          <w:p>
+            <w:pPr>
+              <w:spacing w:after="0" w:line="240" w:lineRule="auto"/>
+            </w:pPr>
+            <w:r/>
+            <w:r>
+              <w:rPr>
+                <w:sz w:val="19"/>
+              </w:rPr>
               <w:t>[After NDA]</w:t>
             </w:r>
           </w:p>
@@ -1932,6 +1972,7 @@
         <w:tc>
           <w:tcPr>
             <w:tcW w:type="dxa" w:w="6860"/>
+            <w:shd w:val="clear" w:color="auto" w:fill="F2F4F7"/>
           </w:tcPr>
           <w:p>
             <w:pPr>

</xml_diff>